<commit_message>
feat: aprimorar edição de numeração e nomes de RLI/RLF
  - permite alterar a numeração de relatórios não assinados pelos cards e pela tela de
  detalhe
  - substitui o prompt nativo por modal com a identidade visual do app
  - usa o código do sistema nos nomes de arquivos baixados/gerados de RLI e RLF
  - atualiza testes de nomeação de arquivos para RLI/RLF
  - atualiza os modelos DOCX de RLI e RLF
</commit_message>
<xml_diff>
--- a/Modelos/definitivos/Modelo - RLF.docx
+++ b/Modelos/definitivos/Modelo - RLF.docx
@@ -165,7 +165,6 @@
               </w:rPr>
               <w:t>{{</w:t>
             </w:r>
-            <w:proofErr w:type="spellStart"/>
             <w:r>
               <w:rPr>
                 <w:color w:val="11437E"/>
@@ -174,7 +173,6 @@
               </w:rPr>
               <w:t>description</w:t>
             </w:r>
-            <w:proofErr w:type="spellEnd"/>
             <w:r>
               <w:rPr>
                 <w:color w:val="11437E"/>
@@ -270,25 +268,7 @@
                 <w:sz w:val="18"/>
                 <w:szCs w:val="18"/>
               </w:rPr>
-              <w:t>{{</w:t>
-            </w:r>
-            <w:proofErr w:type="spellStart"/>
-            <w:r>
-              <w:rPr>
-                <w:color w:val="11437E"/>
-                <w:sz w:val="18"/>
-                <w:szCs w:val="18"/>
-              </w:rPr>
-              <w:t>equipament</w:t>
-            </w:r>
-            <w:proofErr w:type="spellEnd"/>
-            <w:r>
-              <w:rPr>
-                <w:color w:val="11437E"/>
-                <w:sz w:val="18"/>
-                <w:szCs w:val="18"/>
-              </w:rPr>
-              <w:t>}}</w:t>
+              <w:t>{{equipament}}</w:t>
             </w:r>
           </w:p>
         </w:tc>
@@ -488,25 +468,7 @@
                 <w:sz w:val="18"/>
                 <w:szCs w:val="18"/>
               </w:rPr>
-              <w:t>{{</w:t>
-            </w:r>
-            <w:proofErr w:type="spellStart"/>
-            <w:r>
-              <w:rPr>
-                <w:color w:val="11437E"/>
-                <w:sz w:val="18"/>
-                <w:szCs w:val="18"/>
-              </w:rPr>
-              <w:t>diagram</w:t>
-            </w:r>
-            <w:proofErr w:type="spellEnd"/>
-            <w:r>
-              <w:rPr>
-                <w:color w:val="11437E"/>
-                <w:sz w:val="18"/>
-                <w:szCs w:val="18"/>
-              </w:rPr>
-              <w:t>}}</w:t>
+              <w:t>{{diagram}}</w:t>
             </w:r>
           </w:p>
         </w:tc>
@@ -555,23 +517,13 @@
               </w:rPr>
               <w:t>{{</w:t>
             </w:r>
-            <w:proofErr w:type="spellStart"/>
-            <w:r>
-              <w:rPr>
-                <w:color w:val="11437E"/>
-                <w:sz w:val="18"/>
-                <w:szCs w:val="18"/>
-              </w:rPr>
-              <w:t>starttime</w:t>
-            </w:r>
-            <w:proofErr w:type="spellEnd"/>
-            <w:r>
-              <w:rPr>
-                <w:color w:val="11437E"/>
-                <w:sz w:val="18"/>
-                <w:szCs w:val="18"/>
-              </w:rPr>
-              <w:t>}</w:t>
+            <w:r>
+              <w:rPr>
+                <w:color w:val="11437E"/>
+                <w:sz w:val="18"/>
+                <w:szCs w:val="18"/>
+              </w:rPr>
+              <w:t>starttime}</w:t>
             </w:r>
             <w:r>
               <w:rPr>
@@ -629,7 +581,6 @@
               </w:rPr>
               <w:t>{{</w:t>
             </w:r>
-            <w:proofErr w:type="spellStart"/>
             <w:r>
               <w:rPr>
                 <w:color w:val="11437E"/>
@@ -638,7 +589,6 @@
               </w:rPr>
               <w:t>endtime</w:t>
             </w:r>
-            <w:proofErr w:type="spellEnd"/>
             <w:r>
               <w:rPr>
                 <w:color w:val="11437E"/>
@@ -700,16 +650,14 @@
               </w:rPr>
               <w:t>{{</w:t>
             </w:r>
-            <w:proofErr w:type="spellStart"/>
-            <w:r>
-              <w:rPr>
-                <w:color w:val="11437E"/>
-                <w:sz w:val="18"/>
-                <w:szCs w:val="18"/>
-              </w:rPr>
-              <w:t>equipament</w:t>
-            </w:r>
-            <w:proofErr w:type="spellEnd"/>
+            <w:r>
+              <w:rPr>
+                <w:color w:val="11437E"/>
+                <w:sz w:val="18"/>
+                <w:szCs w:val="18"/>
+              </w:rPr>
+              <w:t>system</w:t>
+            </w:r>
             <w:r>
               <w:rPr>
                 <w:color w:val="11437E"/>
@@ -780,7 +728,6 @@
               </w:rPr>
               <w:t>{{</w:t>
             </w:r>
-            <w:proofErr w:type="spellStart"/>
             <w:r>
               <w:rPr>
                 <w:color w:val="11437E"/>
@@ -789,7 +736,6 @@
               </w:rPr>
               <w:t>lines</w:t>
             </w:r>
-            <w:proofErr w:type="spellEnd"/>
             <w:r>
               <w:rPr>
                 <w:color w:val="11437E"/>
@@ -840,6 +786,7 @@
                 <w:b/>
                 <w:bCs/>
                 <w:color w:val="E8E8E8"/>
+                <w:u w:val="single"/>
               </w:rPr>
             </w:pPr>
             <w:r>
@@ -1050,23 +997,13 @@
               <w:pStyle w:val="SemEspaamento"/>
               <w:jc w:val="center"/>
             </w:pPr>
-            <w:proofErr w:type="spellStart"/>
-            <w:r>
-              <w:rPr>
-                <w:color w:val="11437E"/>
-                <w:sz w:val="18"/>
-                <w:szCs w:val="18"/>
-              </w:rPr>
-              <w:t>Quimatic</w:t>
-            </w:r>
-            <w:proofErr w:type="spellEnd"/>
-            <w:r>
-              <w:rPr>
-                <w:color w:val="11437E"/>
-                <w:sz w:val="18"/>
-                <w:szCs w:val="18"/>
-              </w:rPr>
-              <w:t xml:space="preserve"> ED BIO</w:t>
+            <w:r>
+              <w:rPr>
+                <w:color w:val="11437E"/>
+                <w:sz w:val="18"/>
+                <w:szCs w:val="18"/>
+              </w:rPr>
+              <w:t>Quimatic ED BIO</w:t>
             </w:r>
           </w:p>
         </w:tc>
@@ -1181,16 +1118,7 @@
                 <w:sz w:val="18"/>
                 <w:szCs w:val="18"/>
               </w:rPr>
-              <w:t xml:space="preserve">Água doce / Filtro de </w:t>
-            </w:r>
-            <w:proofErr w:type="gramStart"/>
-            <w:r>
-              <w:rPr>
-                <w:color w:val="11437E"/>
-                <w:sz w:val="18"/>
-                <w:szCs w:val="18"/>
-              </w:rPr>
-              <w:t xml:space="preserve">100 </w:t>
+              <w:t>Água doce / Filtro de 100</w:t>
             </w:r>
             <w:r>
               <w:rPr>
@@ -1201,25 +1129,14 @@
               </w:rPr>
               <w:t xml:space="preserve"> </w:t>
             </w:r>
-            <w:proofErr w:type="spellStart"/>
-            <w:r>
-              <w:rPr>
-                <w:color w:val="11437E"/>
-                <w:sz w:val="18"/>
-                <w:szCs w:val="18"/>
-              </w:rPr>
-              <w:t>μ</w:t>
-            </w:r>
-            <w:proofErr w:type="gramEnd"/>
-            <w:r>
-              <w:rPr>
-                <w:color w:val="11437E"/>
-                <w:sz w:val="18"/>
-                <w:szCs w:val="18"/>
-              </w:rPr>
-              <w:t>m</w:t>
-            </w:r>
-            <w:proofErr w:type="spellEnd"/>
+            <w:r>
+              <w:rPr>
+                <w:color w:val="11437E"/>
+                <w:sz w:val="18"/>
+                <w:szCs w:val="18"/>
+              </w:rPr>
+              <w:t>μm</w:t>
+            </w:r>
           </w:p>
         </w:tc>
         <w:tc>
@@ -1393,7 +1310,6 @@
               </w:rPr>
               <w:t>{{</w:t>
             </w:r>
-            <w:proofErr w:type="spellStart"/>
             <w:r>
               <w:rPr>
                 <w:color w:val="11437E"/>
@@ -1402,7 +1318,6 @@
               </w:rPr>
               <w:t>filterphotos</w:t>
             </w:r>
-            <w:proofErr w:type="spellEnd"/>
             <w:r>
               <w:rPr>
                 <w:color w:val="11437E"/>
@@ -1975,41 +1890,7 @@
                 <w:sz w:val="18"/>
                 <w:szCs w:val="18"/>
               </w:rPr>
-              <w:t>PO-COM 0009 e 000{{</w:t>
-            </w:r>
-            <w:proofErr w:type="spellStart"/>
-            <w:r>
-              <w:rPr>
-                <w:b/>
-                <w:bCs/>
-                <w:color w:val="11437E"/>
-                <w:sz w:val="18"/>
-                <w:szCs w:val="18"/>
-              </w:rPr>
-              <w:t>equipament</w:t>
-            </w:r>
-            <w:proofErr w:type="spellEnd"/>
-            <w:proofErr w:type="gramStart"/>
-            <w:r>
-              <w:rPr>
-                <w:b/>
-                <w:bCs/>
-                <w:color w:val="11437E"/>
-                <w:sz w:val="18"/>
-                <w:szCs w:val="18"/>
-              </w:rPr>
-              <w:t>}}-</w:t>
-            </w:r>
-            <w:proofErr w:type="gramEnd"/>
-            <w:r>
-              <w:rPr>
-                <w:b/>
-                <w:bCs/>
-                <w:color w:val="11437E"/>
-                <w:sz w:val="18"/>
-                <w:szCs w:val="18"/>
-              </w:rPr>
-              <w:t>50500-k-0020-C</w:t>
+              <w:t>PO-COM 0009 e 000{{equipament}}-50500-k-0020-C</w:t>
             </w:r>
           </w:p>
         </w:tc>
@@ -2098,25 +1979,7 @@
                 <w:sz w:val="18"/>
                 <w:szCs w:val="18"/>
               </w:rPr>
-              <w:t>{{</w:t>
-            </w:r>
-            <w:proofErr w:type="spellStart"/>
-            <w:r>
-              <w:rPr>
-                <w:color w:val="11437E"/>
-                <w:sz w:val="18"/>
-                <w:szCs w:val="18"/>
-              </w:rPr>
-              <w:t>obs</w:t>
-            </w:r>
-            <w:proofErr w:type="spellEnd"/>
-            <w:r>
-              <w:rPr>
-                <w:color w:val="11437E"/>
-                <w:sz w:val="18"/>
-                <w:szCs w:val="18"/>
-              </w:rPr>
-              <w:t>}}</w:t>
+              <w:t>{{obs}}</w:t>
             </w:r>
           </w:p>
         </w:tc>
@@ -2223,21 +2086,7 @@
               <w:rPr>
                 <w:color w:val="11437E"/>
               </w:rPr>
-              <w:t xml:space="preserve"> {{</w:t>
-            </w:r>
-            <w:proofErr w:type="spellStart"/>
-            <w:r>
-              <w:rPr>
-                <w:color w:val="11437E"/>
-              </w:rPr>
-              <w:t>leadername</w:t>
-            </w:r>
-            <w:proofErr w:type="spellEnd"/>
-            <w:r>
-              <w:rPr>
-                <w:color w:val="11437E"/>
-              </w:rPr>
-              <w:t>}}</w:t>
+              <w:t xml:space="preserve"> {{leadername}}</w:t>
             </w:r>
           </w:p>
           <w:p>
@@ -2259,21 +2108,7 @@
               <w:rPr>
                 <w:color w:val="11437E"/>
               </w:rPr>
-              <w:t>{{</w:t>
-            </w:r>
-            <w:proofErr w:type="spellStart"/>
-            <w:r>
-              <w:rPr>
-                <w:color w:val="11437E"/>
-              </w:rPr>
-              <w:t>leaderposition</w:t>
-            </w:r>
-            <w:proofErr w:type="spellEnd"/>
-            <w:r>
-              <w:rPr>
-                <w:color w:val="11437E"/>
-              </w:rPr>
-              <w:t>}}</w:t>
+              <w:t>{{leaderposition}}</w:t>
             </w:r>
           </w:p>
         </w:tc>
@@ -3093,7 +2928,6 @@
             </w:rPr>
             <w:t>{{</w:t>
           </w:r>
-          <w:proofErr w:type="spellStart"/>
           <w:r>
             <w:rPr>
               <w:b/>
@@ -3102,7 +2936,6 @@
             </w:rPr>
             <w:t>missiontitle</w:t>
           </w:r>
-          <w:proofErr w:type="spellEnd"/>
           <w:r>
             <w:rPr>
               <w:b/>
@@ -3146,29 +2979,7 @@
               <w:sz w:val="18"/>
               <w:szCs w:val="18"/>
             </w:rPr>
-            <w:t>{{</w:t>
-          </w:r>
-          <w:proofErr w:type="spellStart"/>
-          <w:r>
-            <w:rPr>
-              <w:b/>
-              <w:bCs/>
-              <w:color w:val="11437E"/>
-              <w:sz w:val="18"/>
-              <w:szCs w:val="18"/>
-            </w:rPr>
-            <w:t>client</w:t>
-          </w:r>
-          <w:proofErr w:type="spellEnd"/>
-          <w:r>
-            <w:rPr>
-              <w:b/>
-              <w:bCs/>
-              <w:color w:val="11437E"/>
-              <w:sz w:val="18"/>
-              <w:szCs w:val="18"/>
-            </w:rPr>
-            <w:t>}}</w:t>
+            <w:t>{{client}}</w:t>
           </w:r>
         </w:p>
       </w:tc>
@@ -3196,29 +3007,7 @@
               <w:sz w:val="18"/>
               <w:szCs w:val="18"/>
             </w:rPr>
-            <w:t>{{</w:t>
-          </w:r>
-          <w:proofErr w:type="spellStart"/>
-          <w:r>
-            <w:rPr>
-              <w:b/>
-              <w:bCs/>
-              <w:color w:val="11437E"/>
-              <w:sz w:val="18"/>
-              <w:szCs w:val="18"/>
-            </w:rPr>
-            <w:t>proposal</w:t>
-          </w:r>
-          <w:proofErr w:type="spellEnd"/>
-          <w:r>
-            <w:rPr>
-              <w:b/>
-              <w:bCs/>
-              <w:color w:val="11437E"/>
-              <w:sz w:val="18"/>
-              <w:szCs w:val="18"/>
-            </w:rPr>
-            <w:t>}}</w:t>
+            <w:t>{{proposal}}</w:t>
           </w:r>
         </w:p>
       </w:tc>
@@ -3266,7 +3055,6 @@
             </w:rPr>
             <w:t>{{</w:t>
           </w:r>
-          <w:proofErr w:type="spellStart"/>
           <w:r>
             <w:rPr>
               <w:b/>
@@ -3277,7 +3065,6 @@
             </w:rPr>
             <w:t>rlf</w:t>
           </w:r>
-          <w:proofErr w:type="spellEnd"/>
           <w:r>
             <w:rPr>
               <w:b/>
@@ -3330,29 +3117,7 @@
               <w:sz w:val="18"/>
               <w:szCs w:val="18"/>
             </w:rPr>
-            <w:t xml:space="preserve"> {{</w:t>
-          </w:r>
-          <w:proofErr w:type="spellStart"/>
-          <w:r>
-            <w:rPr>
-              <w:b/>
-              <w:bCs/>
-              <w:color w:val="11437E"/>
-              <w:sz w:val="18"/>
-              <w:szCs w:val="18"/>
-            </w:rPr>
-            <w:t>cnpj</w:t>
-          </w:r>
-          <w:proofErr w:type="spellEnd"/>
-          <w:r>
-            <w:rPr>
-              <w:b/>
-              <w:bCs/>
-              <w:color w:val="11437E"/>
-              <w:sz w:val="18"/>
-              <w:szCs w:val="18"/>
-            </w:rPr>
-            <w:t>}}</w:t>
+            <w:t xml:space="preserve"> {{cnpj}}</w:t>
           </w:r>
         </w:p>
       </w:tc>

</xml_diff>